<commit_message>
Add income/expense tracking and Budget Planner; remove old per-category Budgets
- Add editable Income + Total Expense stats to both dashboards, plus a
  6-month income-vs-expense trend chart on web.
- Add a new Budget Planner page (web + mobile): editable sections and line
  items with a spreadsheet-style summary (Income/Expenses/Difference/
  Savings/Balance), backed by new budget_sections/budget_line_items tables.
- Remove the old per-category Budgets page and its Dashboard dependents
  (FinancialHealth, BudgetTips) now that the Planner replaces it.
- Fix parse-receipt CORS/verify_jwt so Capture's auto-fill works from a
  browser, and fix the web-only Alert.alert delete-confirmation bug.

Co-Authored-By: Claude Sonnet 5 <noreply@anthropic.com>
</commit_message>
<xml_diff>
--- a/Expense Tracker.docx
+++ b/Expense Tracker.docx
@@ -93,7 +93,15 @@
     </w:p>
     <w:p>
       <w:r>
-        <w:t>(see the screenshot of design reference I gave you if you need context.</w:t>
+        <w:t>(</w:t>
+      </w:r>
+      <w:proofErr w:type="gramStart"/>
+      <w:r>
+        <w:t>see</w:t>
+      </w:r>
+      <w:proofErr w:type="gramEnd"/>
+      <w:r>
+        <w:t xml:space="preserve"> the screenshot of design reference I gave you if you need context.</w:t>
       </w:r>
     </w:p>
     <w:p>
@@ -423,7 +431,15 @@
     <w:p/>
     <w:p>
       <w:r>
-        <w:t xml:space="preserve">When writing the code, be careful of structuring your CSS selector specificities. It's easy to generate CSS classes that cancel each other out (especially with a type-based selector like .section and </w:t>
+        <w:t xml:space="preserve">When writing the code, be careful of structuring your CSS selector specificities. It's easy to generate CSS classes that cancel each other out (especially with a type-based selector </w:t>
+      </w:r>
+      <w:proofErr w:type="gramStart"/>
+      <w:r>
+        <w:t>like .section</w:t>
+      </w:r>
+      <w:proofErr w:type="gramEnd"/>
+      <w:r>
+        <w:t xml:space="preserve"> and </w:t>
       </w:r>
       <w:proofErr w:type="spellStart"/>
       <w:r>
@@ -738,6 +754,52 @@
         <w:t>Once it connects, sign in with the account you already created (cfelize@protonmail.com) — you'll land on the same data you've already seeded on web. Let me know if it connects or if you hit an error.</w:t>
       </w:r>
     </w:p>
+    <w:p/>
+    <w:p>
+      <w:r>
+        <w:t>Two things only you can finish</w:t>
+      </w:r>
+    </w:p>
+    <w:p>
+      <w:r>
+        <w:t>Scan the QR I sent (or reconnect — server restarted, same address: exp://192.168.4.57:8081) to actually test the mobile app on your phone. This hasn't been confirmed working yet.</w:t>
+      </w:r>
+    </w:p>
+    <w:p>
+      <w:r>
+        <w:t xml:space="preserve">Add your ANTHROPIC_API_KEY in </w:t>
+      </w:r>
+      <w:proofErr w:type="spellStart"/>
+      <w:r>
+        <w:t>Supabase</w:t>
+      </w:r>
+      <w:proofErr w:type="spellEnd"/>
+      <w:r>
+        <w:t xml:space="preserve"> Dashboard → Project Settings → Edge Functions → Secrets, so Capture actually auto-fills receipts instead of falling back to manual entry.</w:t>
+      </w:r>
+    </w:p>
+    <w:p>
+      <w:r>
+        <w:t>What "finished" doesn't include (and why)</w:t>
+      </w:r>
+    </w:p>
+    <w:p>
+      <w:r>
+        <w:t xml:space="preserve">The app is functionally complete against your original spec, but shipping it — an actual Apple Developer account ($99/yr), App Store Connect listing, screenshots, privacy policy, </w:t>
+      </w:r>
+      <w:r>
+        <w:lastRenderedPageBreak/>
+        <w:t>Play Store equivalent, real EAS production builds — involves real money and business decisions only you can make. I have Expo/EAS tooling available now if you want to go there, but I won't trigger a build or touch billing without you explicitly asking for that step.</w:t>
+      </w:r>
+    </w:p>
+    <w:p/>
+    <w:p>
+      <w:r>
+        <w:t>Is there something specific you want polished or added, or are you good with this as the finish line for today?</w:t>
+      </w:r>
+    </w:p>
+    <w:p/>
+    <w:p/>
     <w:sectPr>
       <w:pgSz w:w="12240" w:h="15840"/>
       <w:pgMar w:top="1440" w:right="1440" w:bottom="1440" w:left="1440" w:header="720" w:footer="720" w:gutter="0"/>

</xml_diff>